<commit_message>
Integrated UML in documentation file
</commit_message>
<xml_diff>
--- a/Documentazione/Primo_homework/Documentazione Model Aereoporto.docx
+++ b/Documentazione/Primo_homework/Documentazione Model Aereoporto.docx
@@ -7,6 +7,62 @@
         <w:pStyle w:val="Titolo1"/>
       </w:pPr>
       <w:r>
+        <w:rPr>
+          <w:noProof/>
+        </w:rPr>
+        <w:drawing>
+          <wp:inline distT="0" distB="0" distL="0" distR="0" wp14:anchorId="48A5298B" wp14:editId="22C91F75">
+            <wp:extent cx="6105525" cy="2724150"/>
+            <wp:effectExtent l="0" t="0" r="9525" b="0"/>
+            <wp:docPr id="354855702" name="Immagine 1"/>
+            <wp:cNvGraphicFramePr>
+              <a:graphicFrameLocks xmlns:a="http://schemas.openxmlformats.org/drawingml/2006/main" noChangeAspect="1"/>
+            </wp:cNvGraphicFramePr>
+            <a:graphic xmlns:a="http://schemas.openxmlformats.org/drawingml/2006/main">
+              <a:graphicData uri="http://schemas.openxmlformats.org/drawingml/2006/picture">
+                <pic:pic xmlns:pic="http://schemas.openxmlformats.org/drawingml/2006/picture">
+                  <pic:nvPicPr>
+                    <pic:cNvPr id="0" name="Picture 1"/>
+                    <pic:cNvPicPr>
+                      <a:picLocks noChangeAspect="1" noChangeArrowheads="1"/>
+                    </pic:cNvPicPr>
+                  </pic:nvPicPr>
+                  <pic:blipFill>
+                    <a:blip r:embed="rId5" cstate="print">
+                      <a:extLst>
+                        <a:ext uri="{28A0092B-C50C-407E-A947-70E740481C1C}">
+                          <a14:useLocalDpi xmlns:a14="http://schemas.microsoft.com/office/drawing/2010/main" val="0"/>
+                        </a:ext>
+                      </a:extLst>
+                    </a:blip>
+                    <a:srcRect/>
+                    <a:stretch>
+                      <a:fillRect/>
+                    </a:stretch>
+                  </pic:blipFill>
+                  <pic:spPr bwMode="auto">
+                    <a:xfrm>
+                      <a:off x="0" y="0"/>
+                      <a:ext cx="6105525" cy="2724150"/>
+                    </a:xfrm>
+                    <a:prstGeom prst="rect">
+                      <a:avLst/>
+                    </a:prstGeom>
+                    <a:noFill/>
+                    <a:ln>
+                      <a:noFill/>
+                    </a:ln>
+                  </pic:spPr>
+                </pic:pic>
+              </a:graphicData>
+            </a:graphic>
+          </wp:inline>
+        </w:drawing>
+      </w:r>
+      <w:r>
+        <w:rPr>
+          <w:u w:val="single"/>
+        </w:rPr>
         <w:t>User</w:t>
       </w:r>
     </w:p>
@@ -160,7 +216,6 @@
       <w:r>
         <w:t xml:space="preserve"> che rappresenta gli utenti del sistema che possono prenotare voli per conto di passeggeri (salvati poi come </w:t>
       </w:r>
-      <w:proofErr w:type="spellStart"/>
       <w:r>
         <w:rPr>
           <w:i/>
@@ -168,7 +223,6 @@
         </w:rPr>
         <w:t>Passenger</w:t>
       </w:r>
-      <w:proofErr w:type="spellEnd"/>
       <w:r>
         <w:t>).</w:t>
       </w:r>
@@ -245,15 +299,7 @@
         <w:t>Customer</w:t>
       </w:r>
       <w:r>
-        <w:t xml:space="preserve">, la relazione è stata implementata con un </w:t>
-      </w:r>
-      <w:proofErr w:type="spellStart"/>
-      <w:r>
-        <w:t>ArrayList</w:t>
-      </w:r>
-      <w:proofErr w:type="spellEnd"/>
-      <w:r>
-        <w:t xml:space="preserve"> di </w:t>
+        <w:t xml:space="preserve">, la relazione è stata implementata con un ArrayList di </w:t>
       </w:r>
       <w:r>
         <w:rPr>
@@ -285,7 +331,6 @@
       <w:r>
         <w:t xml:space="preserve"> dispone di metodi per effettuare prenotazioni, cercare le prenotazioni già effettuate e verificarne lo stato e modificarle o disdirle. Può inoltre segnalare la perdita di un </w:t>
       </w:r>
-      <w:proofErr w:type="spellStart"/>
       <w:r>
         <w:rPr>
           <w:i/>
@@ -293,11 +338,9 @@
         </w:rPr>
         <w:t>Luggage</w:t>
       </w:r>
-      <w:proofErr w:type="spellEnd"/>
       <w:r>
         <w:t xml:space="preserve"> per conto di </w:t>
       </w:r>
-      <w:proofErr w:type="spellStart"/>
       <w:r>
         <w:rPr>
           <w:i/>
@@ -305,7 +348,6 @@
         </w:rPr>
         <w:t>Passenger</w:t>
       </w:r>
-      <w:proofErr w:type="spellEnd"/>
       <w:r>
         <w:t xml:space="preserve"> per cui ha effettuato la prenotazione.</w:t>
       </w:r>
@@ -315,6 +357,7 @@
         <w:pStyle w:val="Titolo1"/>
       </w:pPr>
       <w:r>
+        <w:lastRenderedPageBreak/>
         <w:t>Booking</w:t>
       </w:r>
     </w:p>
@@ -372,17 +415,8 @@
         <w:t>s</w:t>
       </w:r>
       <w:r>
-        <w:t>tatus, rappresenta lo stato della prenotazione e ha il suo dominio nell’</w:t>
-      </w:r>
-      <w:proofErr w:type="spellStart"/>
-      <w:r>
-        <w:t>enumeration</w:t>
-      </w:r>
-      <w:proofErr w:type="spellEnd"/>
-      <w:r>
-        <w:t xml:space="preserve"> </w:t>
-      </w:r>
-      <w:proofErr w:type="spellStart"/>
+        <w:t xml:space="preserve">tatus, rappresenta lo stato della prenotazione e ha il suo dominio nell’enumeration </w:t>
+      </w:r>
       <w:r>
         <w:rPr>
           <w:i/>
@@ -390,41 +424,8 @@
         </w:rPr>
         <w:t>BookingStatus</w:t>
       </w:r>
-      <w:proofErr w:type="spellEnd"/>
-      <w:r>
-        <w:t xml:space="preserve"> (</w:t>
-      </w:r>
-      <w:proofErr w:type="spellStart"/>
-      <w:r>
-        <w:t>booked</w:t>
-      </w:r>
-      <w:proofErr w:type="spellEnd"/>
-      <w:r>
-        <w:t xml:space="preserve">, </w:t>
-      </w:r>
-      <w:proofErr w:type="spellStart"/>
-      <w:r>
-        <w:t>confirmed</w:t>
-      </w:r>
-      <w:proofErr w:type="spellEnd"/>
-      <w:r>
-        <w:t xml:space="preserve">, </w:t>
-      </w:r>
-      <w:proofErr w:type="spellStart"/>
-      <w:r>
-        <w:t>pending</w:t>
-      </w:r>
-      <w:proofErr w:type="spellEnd"/>
-      <w:r>
-        <w:t xml:space="preserve">, </w:t>
-      </w:r>
-      <w:proofErr w:type="spellStart"/>
-      <w:r>
-        <w:t>cancelled</w:t>
-      </w:r>
-      <w:proofErr w:type="spellEnd"/>
-      <w:r>
-        <w:t>).</w:t>
+      <w:r>
+        <w:t xml:space="preserve"> (booked, confirmed, pending, cancelled).</w:t>
       </w:r>
     </w:p>
     <w:p/>
@@ -434,7 +435,6 @@
         <w:pStyle w:val="Titolo2"/>
       </w:pPr>
       <w:r>
-        <w:lastRenderedPageBreak/>
         <w:t>Relazioni</w:t>
       </w:r>
     </w:p>
@@ -562,73 +562,48 @@
           <w:numId w:val="1"/>
         </w:numPr>
       </w:pPr>
-      <w:proofErr w:type="spellStart"/>
-      <w:r>
-        <w:rPr>
-          <w:i/>
-          <w:iCs/>
-        </w:rPr>
+      <w:r>
+        <w:rPr>
+          <w:i/>
+          <w:iCs/>
+        </w:rPr>
+        <w:t>Passenger:</w:t>
+      </w:r>
+      <w:r>
+        <w:t xml:space="preserve"> relazione di aggregazione (i passeggeri sono parte della prenotazione) di tipo uno a molti, in particolare non può esistere un’istanza della classe </w:t>
+      </w:r>
+      <w:r>
+        <w:rPr>
+          <w:i/>
+          <w:iCs/>
+        </w:rPr>
+        <w:t>Booking</w:t>
+      </w:r>
+      <w:r>
+        <w:t xml:space="preserve"> che non è in relazione con almeno un’istanza della classe </w:t>
+      </w:r>
+      <w:r>
+        <w:rPr>
+          <w:i/>
+          <w:iCs/>
+        </w:rPr>
+        <w:t>Passenger;</w:t>
+      </w:r>
+      <w:r>
+        <w:t xml:space="preserve"> la visibilità è unidirezionale, in quanto i clienti devono essere in grado di visualizzare i passeggeri che fanno parte delle proprie prenotazioni.</w:t>
+      </w:r>
+    </w:p>
+    <w:p>
+      <w:pPr>
+        <w:pStyle w:val="Titolo1"/>
+      </w:pPr>
+      <w:r>
         <w:t>Passenger</w:t>
       </w:r>
-      <w:proofErr w:type="spellEnd"/>
-      <w:r>
-        <w:rPr>
-          <w:i/>
-          <w:iCs/>
-        </w:rPr>
-        <w:t>:</w:t>
-      </w:r>
-      <w:r>
-        <w:t xml:space="preserve"> relazione di aggregazione (i passeggeri sono parte della prenotazione) di tipo uno a molti, in particolare non può esistere un’istanza della classe </w:t>
-      </w:r>
-      <w:r>
-        <w:rPr>
-          <w:i/>
-          <w:iCs/>
-        </w:rPr>
-        <w:t>Booking</w:t>
-      </w:r>
-      <w:r>
-        <w:t xml:space="preserve"> che non è in relazione con almeno un’istanza della classe </w:t>
-      </w:r>
-      <w:proofErr w:type="spellStart"/>
-      <w:r>
-        <w:rPr>
-          <w:i/>
-          <w:iCs/>
-        </w:rPr>
-        <w:t>Passenger</w:t>
-      </w:r>
-      <w:proofErr w:type="spellEnd"/>
-      <w:r>
-        <w:rPr>
-          <w:i/>
-          <w:iCs/>
-        </w:rPr>
-        <w:t>;</w:t>
-      </w:r>
-      <w:r>
-        <w:t xml:space="preserve"> la visibilità è unidirezionale, in quanto i clienti devono essere in grado di visualizzare i passeggeri che fanno parte delle proprie prenotazioni.</w:t>
-      </w:r>
-    </w:p>
-    <w:p>
-      <w:pPr>
-        <w:pStyle w:val="Titolo1"/>
-      </w:pPr>
-      <w:proofErr w:type="spellStart"/>
-      <w:r>
-        <w:t>Passenger</w:t>
-      </w:r>
-      <w:proofErr w:type="spellEnd"/>
-    </w:p>
-    <w:p>
-      <w:proofErr w:type="spellStart"/>
-      <w:r>
-        <w:t>Passenger</w:t>
-      </w:r>
-      <w:proofErr w:type="spellEnd"/>
-      <w:r>
-        <w:t xml:space="preserve"> è la classe le cui istanze rappresentano i passeggeri che prendono parte ai voli. Essi non accedono al database e non eseguono operazioni su di esso come gli utenti, in quanto esistono solo in relazione alla prenotazione e al volo di cui fanno parte</w:t>
+    </w:p>
+    <w:p>
+      <w:r>
+        <w:t>Passenger è la classe le cui istanze rappresentano i passeggeri che prendono parte ai voli. Essi non accedono al database e non eseguono operazioni su di esso come gli utenti, in quanto esistono solo in relazione alla prenotazione e al volo di cui fanno parte</w:t>
       </w:r>
       <w:r>
         <w:t xml:space="preserve">, per queste operazioni vedere </w:t>
@@ -659,27 +634,17 @@
           <w:numId w:val="2"/>
         </w:numPr>
       </w:pPr>
-      <w:proofErr w:type="spellStart"/>
       <w:r>
         <w:t>f</w:t>
       </w:r>
       <w:r>
-        <w:t>irstname</w:t>
-      </w:r>
-      <w:proofErr w:type="spellEnd"/>
-      <w:r>
-        <w:t xml:space="preserve">, </w:t>
-      </w:r>
-      <w:proofErr w:type="spellStart"/>
+        <w:t xml:space="preserve">irstname, </w:t>
+      </w:r>
       <w:r>
         <w:t>l</w:t>
       </w:r>
       <w:r>
-        <w:t>astname</w:t>
-      </w:r>
-      <w:proofErr w:type="spellEnd"/>
-      <w:r>
-        <w:t xml:space="preserve"> e SSN rappresentano le informazioni personali del passeggero.</w:t>
+        <w:t>astname e SSN rappresentano le informazioni personali del passeggero.</w:t>
       </w:r>
     </w:p>
     <w:p>
@@ -689,16 +654,11 @@
           <w:numId w:val="2"/>
         </w:numPr>
       </w:pPr>
-      <w:proofErr w:type="spellStart"/>
       <w:r>
         <w:t>t</w:t>
       </w:r>
       <w:r>
-        <w:t>icket_number</w:t>
-      </w:r>
-      <w:proofErr w:type="spellEnd"/>
-      <w:r>
-        <w:t>, è il biglietto che identifica un passeggero.</w:t>
+        <w:t>icket_number, è il biglietto che identifica un passeggero.</w:t>
       </w:r>
     </w:p>
     <w:p>
@@ -708,16 +668,11 @@
           <w:numId w:val="2"/>
         </w:numPr>
       </w:pPr>
-      <w:proofErr w:type="spellStart"/>
       <w:r>
         <w:t>s</w:t>
       </w:r>
       <w:r>
-        <w:t>eat</w:t>
-      </w:r>
-      <w:proofErr w:type="spellEnd"/>
-      <w:r>
-        <w:t>, rappresenta il posto a sedere del passeggero su un determinato volo.</w:t>
+        <w:t>eat, rappresenta il posto a sedere del passeggero su un determinato volo.</w:t>
       </w:r>
     </w:p>
     <w:p>
@@ -729,7 +684,6 @@
       </w:r>
     </w:p>
     <w:p>
-      <w:proofErr w:type="spellStart"/>
       <w:r>
         <w:rPr>
           <w:i/>
@@ -737,7 +691,6 @@
         </w:rPr>
         <w:t>Passenger</w:t>
       </w:r>
-      <w:proofErr w:type="spellEnd"/>
       <w:r>
         <w:t xml:space="preserve"> partecipa a relazioni con:</w:t>
       </w:r>
@@ -759,7 +712,6 @@
       <w:r>
         <w:t xml:space="preserve">: relazione di aggregazione (i passeggeri sono parte della prenotazione) di tipo molti a uno, in particolare non può esistere un’istanza della classe </w:t>
       </w:r>
-      <w:proofErr w:type="spellStart"/>
       <w:r>
         <w:rPr>
           <w:i/>
@@ -767,9 +719,12 @@
         </w:rPr>
         <w:t>Passenger</w:t>
       </w:r>
-      <w:proofErr w:type="spellEnd"/>
-      <w:r>
-        <w:t xml:space="preserve"> che non è in relazione con un’istanza della classe </w:t>
+      <w:r>
+        <w:t xml:space="preserve"> che non è in relazione </w:t>
+      </w:r>
+      <w:r>
+        <w:lastRenderedPageBreak/>
+        <w:t xml:space="preserve">con un’istanza della classe </w:t>
       </w:r>
       <w:r>
         <w:rPr>
@@ -799,7 +754,6 @@
       <w:r>
         <w:t xml:space="preserve">relazione di tipo molti a uno, in particolare non può esistere un’istanza della classe </w:t>
       </w:r>
-      <w:proofErr w:type="spellStart"/>
       <w:r>
         <w:rPr>
           <w:i/>
@@ -807,7 +761,6 @@
         </w:rPr>
         <w:t>Passenger</w:t>
       </w:r>
-      <w:proofErr w:type="spellEnd"/>
       <w:r>
         <w:t xml:space="preserve"> che non è in relazione con un’istanza della classe </w:t>
       </w:r>
@@ -829,7 +782,16 @@
           <w:numId w:val="3"/>
         </w:numPr>
       </w:pPr>
-      <w:proofErr w:type="spellStart"/>
+      <w:r>
+        <w:rPr>
+          <w:i/>
+          <w:iCs/>
+        </w:rPr>
+        <w:t xml:space="preserve">Luggage: </w:t>
+      </w:r>
+      <w:r>
+        <w:t xml:space="preserve">relazione di tipo uno a molti, la visibilità è bidirezionale, in quanto gli utenti tramite i passeggeri devono essere in grado di risalire ai loro bagagli (per il verso opposto vedere la classe </w:t>
+      </w:r>
       <w:r>
         <w:rPr>
           <w:i/>
@@ -837,51 +799,26 @@
         </w:rPr>
         <w:t>Luggage</w:t>
       </w:r>
-      <w:proofErr w:type="spellEnd"/>
-      <w:r>
-        <w:rPr>
-          <w:i/>
-          <w:iCs/>
-        </w:rPr>
-        <w:t xml:space="preserve">: </w:t>
-      </w:r>
-      <w:r>
-        <w:t xml:space="preserve">relazione di tipo uno a molti, la visibilità è bidirezionale, in quanto gli utenti tramite i passeggeri devono essere in grado di risalire ai loro bagagli (per il verso opposto vedere la classe </w:t>
-      </w:r>
-      <w:proofErr w:type="spellStart"/>
-      <w:r>
-        <w:rPr>
-          <w:i/>
-          <w:iCs/>
-        </w:rPr>
+      <w:r>
+        <w:t>).</w:t>
+      </w:r>
+    </w:p>
+    <w:p>
+      <w:pPr>
+        <w:pStyle w:val="Titolo1"/>
+      </w:pPr>
+      <w:r>
         <w:t>Luggage</w:t>
       </w:r>
-      <w:proofErr w:type="spellEnd"/>
-      <w:r>
-        <w:t>).</w:t>
-      </w:r>
-    </w:p>
-    <w:p>
-      <w:pPr>
-        <w:pStyle w:val="Titolo1"/>
-      </w:pPr>
-      <w:proofErr w:type="spellStart"/>
-      <w:r>
-        <w:lastRenderedPageBreak/>
+    </w:p>
+    <w:p>
+      <w:r>
+        <w:rPr>
+          <w:i/>
+          <w:iCs/>
+        </w:rPr>
         <w:t>Luggage</w:t>
       </w:r>
-      <w:proofErr w:type="spellEnd"/>
-    </w:p>
-    <w:p>
-      <w:proofErr w:type="spellStart"/>
-      <w:r>
-        <w:rPr>
-          <w:i/>
-          <w:iCs/>
-        </w:rPr>
-        <w:t>Luggage</w:t>
-      </w:r>
-      <w:proofErr w:type="spellEnd"/>
       <w:r>
         <w:t xml:space="preserve"> è la classe le cui istanze rappresentano i bagagli posseduti dai passeggeri.</w:t>
       </w:r>
@@ -915,26 +852,12 @@
           <w:numId w:val="3"/>
         </w:numPr>
       </w:pPr>
-      <w:proofErr w:type="spellStart"/>
       <w:r>
         <w:t>t</w:t>
       </w:r>
       <w:r>
-        <w:t>ype</w:t>
-      </w:r>
-      <w:proofErr w:type="spellEnd"/>
-      <w:r>
-        <w:t>, definisce il tipo di bagaglio e ha il suo dominio nell’</w:t>
-      </w:r>
-      <w:proofErr w:type="spellStart"/>
-      <w:r>
-        <w:t>enumeration</w:t>
-      </w:r>
-      <w:proofErr w:type="spellEnd"/>
-      <w:r>
-        <w:t xml:space="preserve"> </w:t>
-      </w:r>
-      <w:proofErr w:type="spellStart"/>
+        <w:t xml:space="preserve">ype, definisce il tipo di bagaglio e ha il suo dominio nell’enumeration </w:t>
+      </w:r>
       <w:r>
         <w:rPr>
           <w:i/>
@@ -942,25 +865,8 @@
         </w:rPr>
         <w:t>LuggageType</w:t>
       </w:r>
-      <w:proofErr w:type="spellEnd"/>
-      <w:r>
-        <w:t xml:space="preserve"> (</w:t>
-      </w:r>
-      <w:proofErr w:type="spellStart"/>
-      <w:r>
-        <w:t>carry_on</w:t>
-      </w:r>
-      <w:proofErr w:type="spellEnd"/>
-      <w:r>
-        <w:t xml:space="preserve">, </w:t>
-      </w:r>
-      <w:proofErr w:type="spellStart"/>
-      <w:r>
-        <w:t>checked</w:t>
-      </w:r>
-      <w:proofErr w:type="spellEnd"/>
-      <w:r>
-        <w:t>).</w:t>
+      <w:r>
+        <w:t xml:space="preserve"> (carry_on, checked).</w:t>
       </w:r>
     </w:p>
     <w:p>
@@ -974,17 +880,8 @@
         <w:t>s</w:t>
       </w:r>
       <w:r>
-        <w:t>tatus, definisce lo stato del bagaglio e ha il suo dominio nell’</w:t>
-      </w:r>
-      <w:proofErr w:type="spellStart"/>
-      <w:r>
-        <w:t>enumeration</w:t>
-      </w:r>
-      <w:proofErr w:type="spellEnd"/>
-      <w:r>
-        <w:t xml:space="preserve"> </w:t>
-      </w:r>
-      <w:proofErr w:type="spellStart"/>
+        <w:t xml:space="preserve">tatus, definisce lo stato del bagaglio e ha il suo dominio nell’enumeration </w:t>
+      </w:r>
       <w:r>
         <w:rPr>
           <w:i/>
@@ -1004,50 +901,10 @@
           <w:i/>
           <w:iCs/>
         </w:rPr>
-        <w:t>atus</w:t>
-      </w:r>
-      <w:proofErr w:type="spellEnd"/>
-      <w:r>
-        <w:rPr>
-          <w:i/>
-          <w:iCs/>
-        </w:rPr>
-        <w:t xml:space="preserve"> </w:t>
-      </w:r>
-      <w:r>
-        <w:t>(</w:t>
-      </w:r>
-      <w:proofErr w:type="spellStart"/>
-      <w:r>
-        <w:t>booked</w:t>
-      </w:r>
-      <w:proofErr w:type="spellEnd"/>
-      <w:r>
-        <w:t xml:space="preserve">, </w:t>
-      </w:r>
-      <w:proofErr w:type="spellStart"/>
-      <w:r>
-        <w:t>loaded</w:t>
-      </w:r>
-      <w:proofErr w:type="spellEnd"/>
-      <w:r>
-        <w:t xml:space="preserve">, </w:t>
-      </w:r>
-      <w:proofErr w:type="spellStart"/>
-      <w:r>
-        <w:t>withdrawable</w:t>
-      </w:r>
-      <w:proofErr w:type="spellEnd"/>
-      <w:r>
-        <w:t xml:space="preserve">, </w:t>
-      </w:r>
-      <w:proofErr w:type="spellStart"/>
-      <w:r>
-        <w:t>lost</w:t>
-      </w:r>
-      <w:proofErr w:type="spellEnd"/>
-      <w:r>
-        <w:t>).</w:t>
+        <w:t xml:space="preserve">atus </w:t>
+      </w:r>
+      <w:r>
+        <w:t>(booked, loaded, withdrawable, lost).</w:t>
       </w:r>
     </w:p>
     <w:p>
@@ -1065,7 +922,36 @@
           <w:numId w:val="1"/>
         </w:numPr>
       </w:pPr>
-      <w:proofErr w:type="spellStart"/>
+      <w:r>
+        <w:rPr>
+          <w:i/>
+          <w:iCs/>
+        </w:rPr>
+        <w:t>Passenger:</w:t>
+      </w:r>
+      <w:r>
+        <w:t xml:space="preserve"> relazione di tipo molti a uno, in particolare non può esistere un’istanza della classe </w:t>
+      </w:r>
+      <w:r>
+        <w:rPr>
+          <w:i/>
+          <w:iCs/>
+        </w:rPr>
+        <w:t>Luggage</w:t>
+      </w:r>
+      <w:r>
+        <w:t xml:space="preserve"> che non è in relazione con un’istanza della classe </w:t>
+      </w:r>
+      <w:r>
+        <w:rPr>
+          <w:i/>
+          <w:iCs/>
+        </w:rPr>
+        <w:t>Passenger;</w:t>
+      </w:r>
+      <w:r>
+        <w:t xml:space="preserve"> la visibilità è bidirezionale, in quanto è necessario poter risalire al proprietario di un determinato bagaglio (per il verso opposto vedere la classe </w:t>
+      </w:r>
       <w:r>
         <w:rPr>
           <w:i/>
@@ -1073,57 +959,6 @@
         </w:rPr>
         <w:t>Passenger</w:t>
       </w:r>
-      <w:proofErr w:type="spellEnd"/>
-      <w:r>
-        <w:rPr>
-          <w:i/>
-          <w:iCs/>
-        </w:rPr>
-        <w:t>:</w:t>
-      </w:r>
-      <w:r>
-        <w:t xml:space="preserve"> relazione di tipo molti a uno, in particolare non può esistere un’istanza della classe </w:t>
-      </w:r>
-      <w:proofErr w:type="spellStart"/>
-      <w:r>
-        <w:rPr>
-          <w:i/>
-          <w:iCs/>
-        </w:rPr>
-        <w:t>Luggage</w:t>
-      </w:r>
-      <w:proofErr w:type="spellEnd"/>
-      <w:r>
-        <w:t xml:space="preserve"> che non è in relazione con un’istanza della classe </w:t>
-      </w:r>
-      <w:proofErr w:type="spellStart"/>
-      <w:r>
-        <w:rPr>
-          <w:i/>
-          <w:iCs/>
-        </w:rPr>
-        <w:t>Passenger</w:t>
-      </w:r>
-      <w:proofErr w:type="spellEnd"/>
-      <w:r>
-        <w:rPr>
-          <w:i/>
-          <w:iCs/>
-        </w:rPr>
-        <w:t>;</w:t>
-      </w:r>
-      <w:r>
-        <w:t xml:space="preserve"> la visibilità è bidirezionale, in quanto è necessario poter risalire al proprietario di un determinato bagaglio (per il verso opposto vedere la classe </w:t>
-      </w:r>
-      <w:proofErr w:type="spellStart"/>
-      <w:r>
-        <w:rPr>
-          <w:i/>
-          <w:iCs/>
-        </w:rPr>
-        <w:t>Passenger</w:t>
-      </w:r>
-      <w:proofErr w:type="spellEnd"/>
       <w:r>
         <w:t>).</w:t>
       </w:r>
@@ -1165,7 +1000,6 @@
       <w:r>
         <w:t xml:space="preserve"> </w:t>
       </w:r>
-      <w:proofErr w:type="spellStart"/>
       <w:r>
         <w:rPr>
           <w:i/>
@@ -1173,11 +1007,9 @@
         </w:rPr>
         <w:t>Departing</w:t>
       </w:r>
-      <w:proofErr w:type="spellEnd"/>
       <w:r>
         <w:t xml:space="preserve"> e </w:t>
       </w:r>
-      <w:proofErr w:type="spellStart"/>
       <w:r>
         <w:rPr>
           <w:i/>
@@ -1192,7 +1024,6 @@
         </w:rPr>
         <w:t>ing</w:t>
       </w:r>
-      <w:proofErr w:type="spellEnd"/>
       <w:r>
         <w:t xml:space="preserve">, </w:t>
       </w:r>
@@ -1247,72 +1078,25 @@
       <w:r>
         <w:t>, con dominio nell’</w:t>
       </w:r>
-      <w:proofErr w:type="spellStart"/>
-      <w:r>
-        <w:t>enumeration</w:t>
-      </w:r>
-      <w:proofErr w:type="spellEnd"/>
-      <w:r>
+      <w:r>
+        <w:t xml:space="preserve">enumeration </w:t>
+      </w:r>
+      <w:r>
+        <w:rPr>
+          <w:i/>
+          <w:iCs/>
+        </w:rPr>
+        <w:t>FlightStatus</w:t>
+      </w:r>
+      <w:r>
+        <w:rPr>
+          <w:i/>
+          <w:iCs/>
+        </w:rPr>
         <w:t xml:space="preserve"> </w:t>
       </w:r>
-      <w:proofErr w:type="spellStart"/>
-      <w:r>
-        <w:rPr>
-          <w:i/>
-          <w:iCs/>
-        </w:rPr>
-        <w:t>FlightStatus</w:t>
-      </w:r>
-      <w:proofErr w:type="spellEnd"/>
-      <w:r>
-        <w:rPr>
-          <w:i/>
-          <w:iCs/>
-        </w:rPr>
-        <w:t xml:space="preserve"> </w:t>
-      </w:r>
-      <w:r>
-        <w:t>(</w:t>
-      </w:r>
-      <w:proofErr w:type="spellStart"/>
-      <w:r>
-        <w:t>programmed</w:t>
-      </w:r>
-      <w:proofErr w:type="spellEnd"/>
-      <w:r>
-        <w:t xml:space="preserve">, </w:t>
-      </w:r>
-      <w:proofErr w:type="spellStart"/>
-      <w:r>
-        <w:t>cancelled</w:t>
-      </w:r>
-      <w:proofErr w:type="spellEnd"/>
-      <w:r>
-        <w:t xml:space="preserve">, </w:t>
-      </w:r>
-      <w:proofErr w:type="spellStart"/>
-      <w:r>
-        <w:t>departed</w:t>
-      </w:r>
-      <w:proofErr w:type="spellEnd"/>
-      <w:r>
-        <w:t xml:space="preserve">, </w:t>
-      </w:r>
-      <w:proofErr w:type="spellStart"/>
-      <w:r>
-        <w:t>delayed</w:t>
-      </w:r>
-      <w:proofErr w:type="spellEnd"/>
-      <w:r>
-        <w:t xml:space="preserve">, </w:t>
-      </w:r>
-      <w:proofErr w:type="spellStart"/>
-      <w:r>
-        <w:t>landed</w:t>
-      </w:r>
-      <w:proofErr w:type="spellEnd"/>
-      <w:r>
-        <w:t>).</w:t>
+      <w:r>
+        <w:t>(programmed, cancelled, departed, delayed, landed).</w:t>
       </w:r>
     </w:p>
     <w:p>
@@ -1322,21 +1106,8 @@
           <w:numId w:val="7"/>
         </w:numPr>
       </w:pPr>
-      <w:proofErr w:type="spellStart"/>
-      <w:r>
-        <w:t>max_seats</w:t>
-      </w:r>
-      <w:proofErr w:type="spellEnd"/>
-      <w:r>
-        <w:t xml:space="preserve"> e </w:t>
-      </w:r>
-      <w:proofErr w:type="spellStart"/>
-      <w:r>
-        <w:t>free_seats</w:t>
-      </w:r>
-      <w:proofErr w:type="spellEnd"/>
-      <w:r>
-        <w:t xml:space="preserve"> vengono utilizzati per </w:t>
+      <w:r>
+        <w:t xml:space="preserve">max_seats e free_seats vengono utilizzati per </w:t>
       </w:r>
       <w:r>
         <w:t xml:space="preserve">gestire </w:t>
@@ -1390,6 +1161,7 @@
           <w:i/>
           <w:iCs/>
         </w:rPr>
+        <w:lastRenderedPageBreak/>
         <w:t>Booking</w:t>
       </w:r>
       <w:r>
@@ -1409,15 +1181,7 @@
         <w:t>Flight</w:t>
       </w:r>
       <w:r>
-        <w:t xml:space="preserve"> con un </w:t>
-      </w:r>
-      <w:proofErr w:type="spellStart"/>
-      <w:r>
-        <w:t>ArrayList</w:t>
-      </w:r>
-      <w:proofErr w:type="spellEnd"/>
-      <w:r>
-        <w:t xml:space="preserve"> di </w:t>
+        <w:t xml:space="preserve"> con un ArrayList di </w:t>
       </w:r>
       <w:r>
         <w:rPr>
@@ -1454,7 +1218,6 @@
           <w:iCs/>
         </w:rPr>
       </w:pPr>
-      <w:proofErr w:type="spellStart"/>
       <w:r>
         <w:rPr>
           <w:i/>
@@ -1462,11 +1225,9 @@
         </w:rPr>
         <w:t>Passenger</w:t>
       </w:r>
-      <w:proofErr w:type="spellEnd"/>
       <w:r>
         <w:t xml:space="preserve">: relazione 1 a molti, la visibilità è unidirezionale (vedere </w:t>
       </w:r>
-      <w:proofErr w:type="spellStart"/>
       <w:r>
         <w:rPr>
           <w:i/>
@@ -1474,7 +1235,6 @@
         </w:rPr>
         <w:t>Passenger</w:t>
       </w:r>
-      <w:proofErr w:type="spellEnd"/>
       <w:r>
         <w:t xml:space="preserve">). </w:t>
       </w:r>
@@ -1482,17 +1242,8 @@
         <w:t>La relazione è</w:t>
       </w:r>
       <w:r>
-        <w:t xml:space="preserve"> implementata con un </w:t>
-      </w:r>
-      <w:proofErr w:type="spellStart"/>
-      <w:r>
-        <w:t>ArrayList</w:t>
-      </w:r>
-      <w:proofErr w:type="spellEnd"/>
-      <w:r>
-        <w:t xml:space="preserve"> di </w:t>
-      </w:r>
-      <w:proofErr w:type="spellStart"/>
+        <w:t xml:space="preserve"> implementata con un ArrayList di </w:t>
+      </w:r>
       <w:r>
         <w:rPr>
           <w:i/>
@@ -1507,7 +1258,6 @@
         </w:rPr>
         <w:t>r</w:t>
       </w:r>
-      <w:proofErr w:type="spellEnd"/>
       <w:r>
         <w:t>.</w:t>
       </w:r>
@@ -1540,15 +1290,88 @@
       <w:pPr>
         <w:pStyle w:val="Titolo1"/>
       </w:pPr>
-      <w:proofErr w:type="spellStart"/>
-      <w:r>
-        <w:lastRenderedPageBreak/>
+      <w:r>
         <w:t>Departing</w:t>
       </w:r>
-      <w:proofErr w:type="spellEnd"/>
-    </w:p>
-    <w:p>
-      <w:proofErr w:type="spellStart"/>
+    </w:p>
+    <w:p>
+      <w:r>
+        <w:rPr>
+          <w:i/>
+          <w:iCs/>
+        </w:rPr>
+        <w:t xml:space="preserve">Departing </w:t>
+      </w:r>
+      <w:r>
+        <w:t xml:space="preserve">è una sottoclasse di </w:t>
+      </w:r>
+      <w:r>
+        <w:rPr>
+          <w:i/>
+          <w:iCs/>
+        </w:rPr>
+        <w:t>Flight</w:t>
+      </w:r>
+      <w:r>
+        <w:t>, rappresenta gli aerei in partenza da Napoli.</w:t>
+      </w:r>
+    </w:p>
+    <w:p>
+      <w:pPr>
+        <w:pStyle w:val="Titolo2"/>
+      </w:pPr>
+      <w:r>
+        <w:t>Attributi</w:t>
+      </w:r>
+    </w:p>
+    <w:p>
+      <w:r>
+        <w:t xml:space="preserve">L’attributo </w:t>
+      </w:r>
+      <w:r>
+        <w:t>departure_delay è rappresentato come un intero</w:t>
+      </w:r>
+      <w:r>
+        <w:t xml:space="preserve"> di minuti</w:t>
+      </w:r>
+      <w:r>
+        <w:t xml:space="preserve"> (inizialmente posto a 0)</w:t>
+      </w:r>
+      <w:r>
+        <w:t xml:space="preserve"> per una facile gestione del codice, deve essere opportunamente convertito in ore e minuti in visualizzazione a schermo.</w:t>
+      </w:r>
+    </w:p>
+    <w:p>
+      <w:pPr>
+        <w:pStyle w:val="Titolo2"/>
+      </w:pPr>
+      <w:r>
+        <w:t>Relazioni</w:t>
+      </w:r>
+    </w:p>
+    <w:p>
+      <w:r>
+        <w:t xml:space="preserve">È in relazione </w:t>
+      </w:r>
+      <w:r>
+        <w:t xml:space="preserve">con la classe </w:t>
+      </w:r>
+      <w:r>
+        <w:rPr>
+          <w:i/>
+          <w:iCs/>
+        </w:rPr>
+        <w:t>Gate</w:t>
+      </w:r>
+      <w:r>
+        <w:t>, con una relazione 1 a molti, la visibilità è unidirezionale</w:t>
+      </w:r>
+      <w:r>
+        <w:t xml:space="preserve">. La </w:t>
+      </w:r>
+      <w:r>
+        <w:t xml:space="preserve">relazione è implementata mettendo in </w:t>
+      </w:r>
       <w:r>
         <w:rPr>
           <w:i/>
@@ -1556,13 +1379,25 @@
         </w:rPr>
         <w:t>Departing</w:t>
       </w:r>
-      <w:proofErr w:type="spellEnd"/>
-      <w:r>
-        <w:rPr>
-          <w:i/>
-          <w:iCs/>
-        </w:rPr>
-        <w:t xml:space="preserve"> </w:t>
+      <w:r>
+        <w:t xml:space="preserve"> l’id del gate come attributo (inizialmente con valore null, sarà istanziato quando l’aereo starà per partire).</w:t>
+      </w:r>
+    </w:p>
+    <w:p>
+      <w:pPr>
+        <w:pStyle w:val="Titolo1"/>
+      </w:pPr>
+      <w:r>
+        <w:t>Arriving</w:t>
+      </w:r>
+    </w:p>
+    <w:p>
+      <w:r>
+        <w:rPr>
+          <w:i/>
+          <w:iCs/>
+        </w:rPr>
+        <w:t xml:space="preserve">Arriving </w:t>
       </w:r>
       <w:r>
         <w:t xml:space="preserve">è una sottoclasse di </w:t>
@@ -1575,7 +1410,7 @@
         <w:t>Flight</w:t>
       </w:r>
       <w:r>
-        <w:t>, rappresenta gli aerei in partenza da Napoli.</w:t>
+        <w:t>, rappresenta gli aerei in arrivo a Napoli.</w:t>
       </w:r>
     </w:p>
     <w:p>
@@ -1588,15 +1423,10 @@
     </w:p>
     <w:p>
       <w:r>
-        <w:t xml:space="preserve">L’attributo </w:t>
-      </w:r>
-      <w:proofErr w:type="spellStart"/>
-      <w:r>
-        <w:t>departure_delay</w:t>
-      </w:r>
-      <w:proofErr w:type="spellEnd"/>
-      <w:r>
-        <w:t xml:space="preserve"> è rappresentato come un intero</w:t>
+        <w:t>L’attributo arrival</w:t>
+      </w:r>
+      <w:r>
+        <w:t>_delay è rappresentato come un intero</w:t>
       </w:r>
       <w:r>
         <w:t xml:space="preserve"> di minuti</w:t>
@@ -1610,36 +1440,34 @@
     </w:p>
     <w:p>
       <w:pPr>
-        <w:pStyle w:val="Titolo2"/>
-      </w:pPr>
-      <w:r>
-        <w:t>Relazioni</w:t>
-      </w:r>
-    </w:p>
-    <w:p>
-      <w:r>
-        <w:t xml:space="preserve">È in relazione </w:t>
-      </w:r>
-      <w:r>
-        <w:t xml:space="preserve">con la classe </w:t>
-      </w:r>
-      <w:r>
-        <w:rPr>
-          <w:i/>
-          <w:iCs/>
-        </w:rPr>
+        <w:pStyle w:val="Titolo1"/>
+      </w:pPr>
+      <w:r>
         <w:t>Gate</w:t>
       </w:r>
-      <w:r>
-        <w:t>, con una relazione 1 a molti, la visibilità è unidirezionale</w:t>
-      </w:r>
-      <w:r>
-        <w:t xml:space="preserve">. La </w:t>
-      </w:r>
-      <w:r>
-        <w:t xml:space="preserve">relazione è implementata mettendo in </w:t>
-      </w:r>
-      <w:proofErr w:type="spellStart"/>
+    </w:p>
+    <w:p>
+      <w:pPr>
+        <w:rPr>
+          <w:u w:val="single"/>
+        </w:rPr>
+      </w:pPr>
+      <w:r>
+        <w:rPr>
+          <w:i/>
+          <w:iCs/>
+        </w:rPr>
+        <w:t xml:space="preserve">Gate </w:t>
+      </w:r>
+      <w:r>
+        <w:t xml:space="preserve">rappresenta </w:t>
+      </w:r>
+      <w:r>
+        <w:t xml:space="preserve">il varco </w:t>
+      </w:r>
+      <w:r>
+        <w:t xml:space="preserve">da cui ogni aereo in partenza può partire, è rappresentato da un id univoco ed è in una relazione 1 a molti con la classe </w:t>
+      </w:r>
       <w:r>
         <w:rPr>
           <w:i/>
@@ -1647,132 +1475,6 @@
         </w:rPr>
         <w:t>Departing</w:t>
       </w:r>
-      <w:proofErr w:type="spellEnd"/>
-      <w:r>
-        <w:t xml:space="preserve"> l’id del gate come attributo (inizialmente con valore </w:t>
-      </w:r>
-      <w:proofErr w:type="spellStart"/>
-      <w:r>
-        <w:t>null</w:t>
-      </w:r>
-      <w:proofErr w:type="spellEnd"/>
-      <w:r>
-        <w:t>, sarà istanziato quando l’aereo starà per partire).</w:t>
-      </w:r>
-    </w:p>
-    <w:p>
-      <w:pPr>
-        <w:pStyle w:val="Titolo1"/>
-      </w:pPr>
-      <w:proofErr w:type="spellStart"/>
-      <w:r>
-        <w:t>Arriving</w:t>
-      </w:r>
-      <w:proofErr w:type="spellEnd"/>
-    </w:p>
-    <w:p>
-      <w:proofErr w:type="spellStart"/>
-      <w:r>
-        <w:rPr>
-          <w:i/>
-          <w:iCs/>
-        </w:rPr>
-        <w:t>Arriving</w:t>
-      </w:r>
-      <w:proofErr w:type="spellEnd"/>
-      <w:r>
-        <w:rPr>
-          <w:i/>
-          <w:iCs/>
-        </w:rPr>
-        <w:t xml:space="preserve"> </w:t>
-      </w:r>
-      <w:r>
-        <w:t xml:space="preserve">è una sottoclasse di </w:t>
-      </w:r>
-      <w:r>
-        <w:rPr>
-          <w:i/>
-          <w:iCs/>
-        </w:rPr>
-        <w:t>Flight</w:t>
-      </w:r>
-      <w:r>
-        <w:t>, rappresenta gli aerei in arrivo a Napoli.</w:t>
-      </w:r>
-    </w:p>
-    <w:p>
-      <w:pPr>
-        <w:pStyle w:val="Titolo2"/>
-      </w:pPr>
-      <w:r>
-        <w:t>Attributi</w:t>
-      </w:r>
-    </w:p>
-    <w:p>
-      <w:r>
-        <w:t xml:space="preserve">L’attributo </w:t>
-      </w:r>
-      <w:proofErr w:type="spellStart"/>
-      <w:r>
-        <w:t>arrival</w:t>
-      </w:r>
-      <w:r>
-        <w:t>_delay</w:t>
-      </w:r>
-      <w:proofErr w:type="spellEnd"/>
-      <w:r>
-        <w:t xml:space="preserve"> è rappresentato come un intero</w:t>
-      </w:r>
-      <w:r>
-        <w:t xml:space="preserve"> di minuti</w:t>
-      </w:r>
-      <w:r>
-        <w:t xml:space="preserve"> (inizialmente posto a 0)</w:t>
-      </w:r>
-      <w:r>
-        <w:t xml:space="preserve"> per una facile gestione del codice, deve essere opportunamente convertito in ore e minuti in visualizzazione a schermo.</w:t>
-      </w:r>
-    </w:p>
-    <w:p>
-      <w:pPr>
-        <w:pStyle w:val="Titolo1"/>
-      </w:pPr>
-      <w:r>
-        <w:t>Gate</w:t>
-      </w:r>
-    </w:p>
-    <w:p>
-      <w:pPr>
-        <w:rPr>
-          <w:u w:val="single"/>
-        </w:rPr>
-      </w:pPr>
-      <w:r>
-        <w:rPr>
-          <w:i/>
-          <w:iCs/>
-        </w:rPr>
-        <w:t xml:space="preserve">Gate </w:t>
-      </w:r>
-      <w:r>
-        <w:t xml:space="preserve">rappresenta </w:t>
-      </w:r>
-      <w:r>
-        <w:t xml:space="preserve">il varco </w:t>
-      </w:r>
-      <w:r>
-        <w:t xml:space="preserve">da cui ogni aereo in partenza può partire, è rappresentato da un id univoco ed è in una relazione 1 a molti con la classe </w:t>
-      </w:r>
-      <w:proofErr w:type="spellStart"/>
-      <w:r>
-        <w:rPr>
-          <w:i/>
-          <w:iCs/>
-        </w:rPr>
-        <w:t>Departing</w:t>
-      </w:r>
-      <w:proofErr w:type="spellEnd"/>
       <w:r>
         <w:t>, con visibilità unidirezionale (il gate non vede gli aerei che partono da esso)</w:t>
       </w:r>

</xml_diff>